<commit_message>
Fixed path in 1a_wrangle_obs_data.R leading to addition of 1 datapoint and reran downstream analysis that was affected by this (no major changes in results)
</commit_message>
<xml_diff>
--- a/Tables/Table_male_counts_model_SAM.docx
+++ b/Tables/Table_male_counts_model_SAM.docx
@@ -129,7 +129,7 @@
               <w:jc w:val="left"/>
             </w:pPr>
             <w:r>
-              <w:t xml:space="preserve">117.60</w:t>
+              <w:t xml:space="preserve">117.68</w:t>
             </w:r>
           </w:p>
         </w:tc>
@@ -141,7 +141,7 @@
               <w:jc w:val="left"/>
             </w:pPr>
             <w:r>
-              <w:t xml:space="preserve">101.27 – 137.53</w:t>
+              <w:t xml:space="preserve">101.37 – 137.56</w:t>
             </w:r>
           </w:p>
         </w:tc>
@@ -153,7 +153,7 @@
               <w:jc w:val="left"/>
             </w:pPr>
             <w:r>
-              <w:t xml:space="preserve">61.10</w:t>
+              <w:t xml:space="preserve">61.26</w:t>
             </w:r>
           </w:p>
         </w:tc>

</xml_diff>

<commit_message>
fix: correct male count for 2002, rerun pipeline (no significant effect on results)
</commit_message>
<xml_diff>
--- a/Tables/Table_male_counts_model_SAM.docx
+++ b/Tables/Table_male_counts_model_SAM.docx
@@ -141,7 +141,7 @@
               <w:jc w:val="left"/>
             </w:pPr>
             <w:r>
-              <w:t xml:space="preserve">101.37 – 137.56</w:t>
+              <w:t xml:space="preserve">103.05 – 135.10</w:t>
             </w:r>
           </w:p>
         </w:tc>
@@ -153,7 +153,7 @@
               <w:jc w:val="left"/>
             </w:pPr>
             <w:r>
-              <w:t xml:space="preserve">61.26</w:t>
+              <w:t xml:space="preserve">69.05</w:t>
             </w:r>
           </w:p>
         </w:tc>
@@ -195,7 +195,7 @@
               <w:jc w:val="left"/>
             </w:pPr>
             <w:r>
-              <w:t xml:space="preserve">0.98</w:t>
+              <w:t xml:space="preserve">0.95</w:t>
             </w:r>
           </w:p>
         </w:tc>
@@ -207,7 +207,7 @@
               <w:jc w:val="left"/>
             </w:pPr>
             <w:r>
-              <w:t xml:space="preserve">0.84 – 1.14</w:t>
+              <w:t xml:space="preserve">0.83 – 1.09</w:t>
             </w:r>
           </w:p>
         </w:tc>
@@ -219,7 +219,7 @@
               <w:jc w:val="left"/>
             </w:pPr>
             <w:r>
-              <w:t xml:space="preserve">-0.28</w:t>
+              <w:t xml:space="preserve">-0.70</w:t>
             </w:r>
           </w:p>
         </w:tc>
@@ -231,7 +231,7 @@
               <w:jc w:val="left"/>
             </w:pPr>
             <w:r>
-              <w:t xml:space="preserve">0.779</w:t>
+              <w:t xml:space="preserve">0.482</w:t>
             </w:r>
           </w:p>
         </w:tc>
@@ -299,7 +299,7 @@
               <w:jc w:val="left"/>
             </w:pPr>
             <w:r>
-              <w:t xml:space="preserve">0.005</w:t>
+              <w:t xml:space="preserve">0.028</w:t>
             </w:r>
           </w:p>
         </w:tc>

</xml_diff>